<commit_message>
Update early-careers CV skills section (AI line, certs, fuller groups)
</commit_message>
<xml_diff>
--- a/Draft&Resume/GabrielIsuekebho_CV_EarlyCareers.docx
+++ b/Draft&Resume/GabrielIsuekebho_CV_EarlyCareers.docx
@@ -149,13 +149,13 @@
           <w:b/>
           <w:sz w:val="19"/>
         </w:rPr>
-        <w:t xml:space="preserve">Languages &amp; Frameworks: </w:t>
+        <w:t xml:space="preserve">Languages: </w:t>
       </w:r>
       <w:r>
         <w:rPr>
           <w:sz w:val="19"/>
         </w:rPr>
-        <w:t>Python, C#, ASP.NET, Django, FastAPI</w:t>
+        <w:t>Python, C#, JavaScript, TypeScript, SQL</w:t>
       </w:r>
     </w:p>
     <w:p>
@@ -167,13 +167,13 @@
           <w:b/>
           <w:sz w:val="19"/>
         </w:rPr>
-        <w:t xml:space="preserve">AI &amp; ML: </w:t>
+        <w:t xml:space="preserve">Backend &amp; APIs: </w:t>
       </w:r>
       <w:r>
         <w:rPr>
           <w:sz w:val="19"/>
         </w:rPr>
-        <w:t>LLMs (Claude, GPT), PyTorch, STT/TTS, AI system design</w:t>
+        <w:t>FastAPI, Django, ASP.NET Core, REST APIs, WebSockets, Microservices</w:t>
       </w:r>
     </w:p>
     <w:p>
@@ -185,13 +185,117 @@
           <w:b/>
           <w:sz w:val="19"/>
         </w:rPr>
-        <w:t xml:space="preserve">Infrastructure &amp; Tools: </w:t>
+        <w:t xml:space="preserve">AI &amp; LLM: </w:t>
       </w:r>
       <w:r>
         <w:rPr>
           <w:sz w:val="19"/>
         </w:rPr>
-        <w:t>AWS, Docker, Kubernetes, PostgreSQL, Redis, Jira, Agile/Scrum</w:t>
+        <w:t>Context engineering, RAG, Harness engineering, AI agents, STT/TTS, LLM integration</w:t>
+      </w:r>
+    </w:p>
+    <w:p>
+      <w:pPr>
+        <w:spacing w:before="0" w:after="40" w:line="240" w:lineRule="auto"/>
+      </w:pPr>
+      <w:r>
+        <w:rPr>
+          <w:b/>
+          <w:sz w:val="19"/>
+        </w:rPr>
+        <w:t xml:space="preserve">Data &amp; Storage: </w:t>
+      </w:r>
+      <w:r>
+        <w:rPr>
+          <w:sz w:val="19"/>
+        </w:rPr>
+        <w:t>PostgreSQL, MySQL, Redis, TimescaleDB</w:t>
+      </w:r>
+    </w:p>
+    <w:p>
+      <w:pPr>
+        <w:spacing w:before="0" w:after="40" w:line="240" w:lineRule="auto"/>
+      </w:pPr>
+      <w:r>
+        <w:rPr>
+          <w:b/>
+          <w:sz w:val="19"/>
+        </w:rPr>
+        <w:t xml:space="preserve">DevOps &amp; Cloud: </w:t>
+      </w:r>
+      <w:r>
+        <w:rPr>
+          <w:sz w:val="19"/>
+        </w:rPr>
+        <w:t>Docker, Kubernetes, AWS, CI/CD, GitHub Actions, Git, Linux</w:t>
+      </w:r>
+    </w:p>
+    <w:p>
+      <w:pPr>
+        <w:spacing w:before="0" w:after="40" w:line="240" w:lineRule="auto"/>
+      </w:pPr>
+      <w:r>
+        <w:rPr>
+          <w:b/>
+          <w:sz w:val="19"/>
+        </w:rPr>
+        <w:t xml:space="preserve">Practices &amp; Tools: </w:t>
+      </w:r>
+      <w:r>
+        <w:rPr>
+          <w:sz w:val="19"/>
+        </w:rPr>
+        <w:t>Agile/Scrum, Testing, Technical documentation, Jira</w:t>
+      </w:r>
+    </w:p>
+    <w:p>
+      <w:pPr>
+        <w:spacing w:before="180" w:after="60" w:line="240" w:lineRule="auto"/>
+        <w:pBdr>
+          <w:bottom w:val="single" w:sz="6" w:space="1" w:color="1F2D3D"/>
+        </w:pBdr>
+      </w:pPr>
+      <w:r>
+        <w:rPr>
+          <w:b/>
+          <w:color w:val="1F2D3D"/>
+          <w:sz w:val="21"/>
+        </w:rPr>
+        <w:t>CERTIFICATIONS</w:t>
+      </w:r>
+    </w:p>
+    <w:p>
+      <w:pPr>
+        <w:spacing w:before="0" w:after="40" w:line="240" w:lineRule="auto"/>
+      </w:pPr>
+      <w:r>
+        <w:rPr>
+          <w:color w:val="1F2D3D"/>
+        </w:rPr>
+        <w:t xml:space="preserve">▹ </w:t>
+      </w:r>
+      <w:r>
+        <w:rPr>
+          <w:sz w:val="19"/>
+        </w:rPr>
+        <w:t>Kubernetes and Cloud Native Associate (KCNA), CNCF</w:t>
+      </w:r>
+    </w:p>
+    <w:p>
+      <w:pPr>
+        <w:spacing w:before="0" w:after="40" w:line="240" w:lineRule="auto"/>
+      </w:pPr>
+      <w:r>
+        <w:rPr>
+          <w:color w:val="1F2D3D"/>
+        </w:rPr>
+        <w:t xml:space="preserve">▹ </w:t>
+      </w:r>
+      <w:r>
+        <w:rPr>
+          <w:sz w:val="19"/>
+        </w:rPr>
+        <w:t>Google Project Management Certificate, Coursera</w:t>
       </w:r>
     </w:p>
     <w:p>

</xml_diff>

<commit_message>
Add Volunteering section to early-careers CVs (move Interswitch ambassador)
</commit_message>
<xml_diff>
--- a/Draft&Resume/GabrielIsuekebho_CV_EarlyCareers.docx
+++ b/Draft&Resume/GabrielIsuekebho_CV_EarlyCareers.docx
@@ -91,9 +91,12 @@
     </w:p>
     <w:p>
       <w:pPr>
-        <w:spacing w:before="0" w:after="40" w:line="240" w:lineRule="auto"/>
+        <w:spacing w:before="0" w:after="40" w:line="252" w:lineRule="auto"/>
       </w:pPr>
       <w:r>
+        <w:rPr>
+          <w:sz w:val="19"/>
+        </w:rPr>
         <w:t>Biochemistry graduate and software engineer with around 2-3 years of experience building and deploying enterprise-grade systems across fintech, carbon tech, and AI-driven infrastructure. Proven ability to operate independently under ambiguity, take ownership of complex problems, and deliver measurable outcomes. Combines technical depth with strong analytical and communication skills developed across scientific and engineering disciplines. Seeking to apply cross-functional problem-solving and systems thinking towards operational excellence and digital transformation.</w:t>
       </w:r>
     </w:p>
@@ -267,6 +270,7 @@
     <w:p>
       <w:pPr>
         <w:spacing w:before="0" w:after="40" w:line="240" w:lineRule="auto"/>
+        <w:ind w:left="288"/>
       </w:pPr>
       <w:r>
         <w:rPr>
@@ -284,6 +288,7 @@
     <w:p>
       <w:pPr>
         <w:spacing w:before="0" w:after="40" w:line="240" w:lineRule="auto"/>
+        <w:ind w:left="288"/>
       </w:pPr>
       <w:r>
         <w:rPr>
@@ -842,7 +847,7 @@
         <w:tabs>
           <w:tab w:pos="10224" w:val="right"/>
         </w:tabs>
-        <w:spacing w:before="40" w:after="0" w:line="240" w:lineRule="auto"/>
+        <w:spacing w:before="100" w:after="0" w:line="240" w:lineRule="auto"/>
       </w:pPr>
       <w:r>
         <w:rPr>
@@ -896,6 +901,61 @@
     </w:p>
     <w:p>
       <w:pPr>
+        <w:spacing w:before="180" w:after="60" w:line="240" w:lineRule="auto"/>
+        <w:pBdr>
+          <w:bottom w:val="single" w:sz="6" w:space="1" w:color="1F2D3D"/>
+        </w:pBdr>
+      </w:pPr>
+      <w:r>
+        <w:rPr>
+          <w:b/>
+          <w:color w:val="1F2D3D"/>
+          <w:sz w:val="21"/>
+        </w:rPr>
+        <w:t>VOLUNTEERING</w:t>
+      </w:r>
+    </w:p>
+    <w:p>
+      <w:pPr>
+        <w:tabs>
+          <w:tab w:pos="10224" w:val="right"/>
+        </w:tabs>
+        <w:spacing w:before="100" w:after="0" w:line="240" w:lineRule="auto"/>
+      </w:pPr>
+      <w:r>
+        <w:rPr>
+          <w:b/>
+          <w:sz w:val="21"/>
+        </w:rPr>
+        <w:t>Interswitch</w:t>
+      </w:r>
+      <w:r>
+        <w:tab/>
+      </w:r>
+      <w:r>
+        <w:rPr>
+          <w:i/>
+          <w:color w:val="4A5560"/>
+          <w:sz w:val="18"/>
+        </w:rPr>
+        <w:t>2023 - 2024</w:t>
+      </w:r>
+    </w:p>
+    <w:p>
+      <w:pPr>
+        <w:spacing w:before="0" w:after="40" w:line="240" w:lineRule="auto"/>
+      </w:pPr>
+      <w:r>
+        <w:rPr>
+          <w:i/>
+          <w:color w:val="1F2D3D"/>
+          <w:sz w:val="19"/>
+        </w:rPr>
+        <w:t>Student Campus Ambassador</w:t>
+      </w:r>
+    </w:p>
+    <w:p>
+      <w:pPr>
         <w:spacing w:before="0" w:after="40" w:line="240" w:lineRule="auto"/>
         <w:ind w:left="288"/>
       </w:pPr>
@@ -909,7 +969,7 @@
         <w:rPr>
           <w:sz w:val="19"/>
         </w:rPr>
-        <w:t>Leadership: Interswitch Student Campus Ambassador (2023 - 2024).</w:t>
+        <w:t>Represented Interswitch on campus, promoting its fintech products and supporting student engagement and events.</w:t>
       </w:r>
     </w:p>
     <w:sectPr>

</xml_diff>